<commit_message>
feat(cv): expérience Royal TS Generator chez BPCE IT (FR+EN), CyberArk en compétences, interligne resserré
Co-Authored-By: Claude Fable 5.1 <noreply@anthropic.com>
</commit_message>
<xml_diff>
--- a/cv-stephen-casse-en.docx
+++ b/cv-stephen-casse-en.docx
@@ -897,6 +897,61 @@
           <w:sz w:val="18"/>
           <w:szCs w:val="18"/>
         </w:rPr>
+        <w:t xml:space="preserve">One terminal, one source of truth</w:t>
+      </w:r>
+      <w:r>
+        <w:rPr>
+          <w:rFonts w:ascii="Calibri" w:hAnsi="Calibri" w:cs="Calibri"/>
+          <w:color w:val="484550"/>
+          <w:sz w:val="18"/>
+          <w:szCs w:val="18"/>
+        </w:rPr>
+        <w:t xml:space="preserve">: two hundred people across business IT and operations opened SSH and RDP sessions daily on more than 1,600 servers with no standard — everyone kept their own connection book, inherited from stale exports, fixed by hand at every VM created or decommissioned. I replaced data entry with generation: an Ansible role queries the CMDB three times a day, filters by each team's entitlements, enriches every host with its connection string through the CyberArk bastion and publishes a Royal TS dynamic folder that reloads itself. Not one connection maintained by hand, </w:t>
+      </w:r>
+      <w:r>
+        <w:rPr>
+          <w:rFonts w:ascii="Calibri" w:hAnsi="Calibri" w:cs="Calibri"/>
+          <w:b/>
+          <w:bCs/>
+          <w:color w:val="484550"/>
+          <w:sz w:val="18"/>
+          <w:szCs w:val="18"/>
+        </w:rPr>
+        <w:t xml:space="preserve">1,700 servers processed in 18 seconds</w:t>
+      </w:r>
+      <w:r>
+        <w:rPr>
+          <w:rFonts w:ascii="Calibri" w:hAnsi="Calibri" w:cs="Calibri"/>
+          <w:color w:val="484550"/>
+          <w:sz w:val="18"/>
+          <w:szCs w:val="18"/>
+        </w:rPr>
+        <w:t xml:space="preserve">, a newcomer operational on day one. Presented to the executive committee, approved, in daily use.</w:t>
+      </w:r>
+    </w:p>
+    <w:p>
+      <w:pPr>
+        <w:spacing w:before="0" w:after="24" w:line="232" w:lineRule="auto"/>
+        <w:ind w:left="227" w:hanging="142"/>
+      </w:pPr>
+      <w:r>
+        <w:rPr>
+          <w:rFonts w:ascii="Calibri" w:hAnsi="Calibri" w:cs="Calibri"/>
+          <w:color w:val="6866A7"/>
+          <w:sz w:val="19"/>
+          <w:szCs w:val="19"/>
+        </w:rPr>
+        <w:t xml:space="preserve">• </w:t>
+      </w:r>
+      <w:r>
+        <w:rPr>
+          <w:rFonts w:ascii="Calibri" w:hAnsi="Calibri" w:cs="Calibri"/>
+          <w:b/>
+          <w:bCs/>
+          <w:color w:val="484550"/>
+          <w:sz w:val="18"/>
+          <w:szCs w:val="18"/>
+        </w:rPr>
         <w:t xml:space="preserve">Logs for developers, without giving them production</w:t>
       </w:r>
       <w:r>
@@ -1667,7 +1722,7 @@
                 <w:sz w:val="15"/>
                 <w:szCs w:val="15"/>
               </w:rPr>
-              <w:t xml:space="preserve">SSL/TLS · OpenSSL · JKS keystores · Venafi · LDAP · Infisical · Authentik · Linux hardening</w:t>
+              <w:t xml:space="preserve">SSL/TLS · OpenSSL · JKS keystores · Venafi · CyberArk (PSM/PSMP) · LDAP · Infisical · Authentik · Linux hardening</w:t>
             </w:r>
           </w:p>
         </w:tc>

</xml_diff>